<commit_message>
committed to main branch:routing-part-2 uploaded
</commit_message>
<xml_diff>
--- a/doc-images/PMS_ViewProduct.docx
+++ b/doc-images/PMS_ViewProduct.docx
@@ -3,6 +3,75 @@
 <w:document xmlns:wpc="http://schemas.microsoft.com/office/word/2010/wordprocessingCanvas" xmlns:cx="http://schemas.microsoft.com/office/drawing/2014/chartex" xmlns:cx1="http://schemas.microsoft.com/office/drawing/2015/9/8/chartex" xmlns:cx2="http://schemas.microsoft.com/office/drawing/2015/10/21/chartex" xmlns:cx3="http://schemas.microsoft.com/office/drawing/2016/5/9/chartex" xmlns:cx4="http://schemas.microsoft.com/office/drawing/2016/5/10/chartex" xmlns:cx5="http://schemas.microsoft.com/office/drawing/2016/5/11/chartex" xmlns:cx6="http://schemas.microsoft.com/office/drawing/2016/5/12/chartex" xmlns:cx7="http://schemas.microsoft.com/office/drawing/2016/5/13/chartex" xmlns:cx8="http://schemas.microsoft.com/office/drawing/2016/5/14/chartex" xmlns:mc="http://schemas.openxmlformats.org/markup-compatibility/2006" xmlns:aink="http://schemas.microsoft.com/office/drawing/2016/ink" xmlns:am3d="http://schemas.microsoft.com/office/drawing/2017/model3d" xmlns:o="urn:schemas-microsoft-com:office:office" xmlns:oel="http://schemas.microsoft.com/office/2019/extlst" xmlns:r="http://schemas.openxmlformats.org/officeDocument/2006/relationships" xmlns:m="http://schemas.openxmlformats.org/officeDocument/2006/math" xmlns:v="urn:schemas-microsoft-com:vml" xmlns:wp14="http://schemas.microsoft.com/office/word/2010/wordprocessingDrawing" xmlns:wp="http://schemas.openxmlformats.org/drawingml/2006/wordprocessingDrawing" xmlns:w10="urn:schemas-microsoft-com:office:word" xmlns:w="http://schemas.openxmlformats.org/wordprocessingml/2006/main" xmlns:w14="http://schemas.microsoft.com/office/word/2010/wordml" xmlns:w15="http://schemas.microsoft.com/office/word/2012/wordml" xmlns:w16cex="http://schemas.microsoft.com/office/word/2018/wordml/cex" xmlns:w16cid="http://schemas.microsoft.com/office/word/2016/wordml/cid" xmlns:w16="http://schemas.microsoft.com/office/word/2018/wordml" xmlns:w16du="http://schemas.microsoft.com/office/word/2023/wordml/word16du" xmlns:w16sdtdh="http://schemas.microsoft.com/office/word/2020/wordml/sdtdatahash" xmlns:w16sdtfl="http://schemas.microsoft.com/office/word/2024/wordml/sdtformatlock" xmlns:w16se="http://schemas.microsoft.com/office/word/2015/wordml/symex" xmlns:wpg="http://schemas.microsoft.com/office/word/2010/wordprocessingGroup" xmlns:wpi="http://schemas.microsoft.com/office/word/2010/wordprocessingInk" xmlns:wne="http://schemas.microsoft.com/office/word/2006/wordml" xmlns:wps="http://schemas.microsoft.com/office/word/2010/wordprocessingShape" mc:Ignorable="w14 w15 w16se w16cid w16 w16cex w16sdtdh w16sdtfl w16du wp14">
   <w:body>
     <w:p>
+      <w:r>
+        <w:rPr>
+          <w:noProof/>
+        </w:rPr>
+        <mc:AlternateContent>
+          <mc:Choice Requires="wps">
+            <w:drawing>
+              <wp:anchor distT="0" distB="0" distL="114300" distR="114300" simplePos="0" relativeHeight="251662336" behindDoc="0" locked="0" layoutInCell="1" allowOverlap="1" wp14:anchorId="696FAEF7" wp14:editId="42D072C6">
+                <wp:simplePos x="0" y="0"/>
+                <wp:positionH relativeFrom="column">
+                  <wp:posOffset>3793066</wp:posOffset>
+                </wp:positionH>
+                <wp:positionV relativeFrom="paragraph">
+                  <wp:posOffset>563033</wp:posOffset>
+                </wp:positionV>
+                <wp:extent cx="8043" cy="1697144"/>
+                <wp:effectExtent l="0" t="0" r="30480" b="36830"/>
+                <wp:wrapNone/>
+                <wp:docPr id="1501247234" name="Straight Connector 2"/>
+                <wp:cNvGraphicFramePr/>
+                <a:graphic xmlns:a="http://schemas.openxmlformats.org/drawingml/2006/main">
+                  <a:graphicData uri="http://schemas.microsoft.com/office/word/2010/wordprocessingShape">
+                    <wps:wsp>
+                      <wps:cNvCnPr/>
+                      <wps:spPr>
+                        <a:xfrm>
+                          <a:off x="0" y="0"/>
+                          <a:ext cx="8043" cy="1697144"/>
+                        </a:xfrm>
+                        <a:prstGeom prst="line">
+                          <a:avLst/>
+                        </a:prstGeom>
+                      </wps:spPr>
+                      <wps:style>
+                        <a:lnRef idx="1">
+                          <a:schemeClr val="accent6"/>
+                        </a:lnRef>
+                        <a:fillRef idx="0">
+                          <a:schemeClr val="accent6"/>
+                        </a:fillRef>
+                        <a:effectRef idx="0">
+                          <a:schemeClr val="accent6"/>
+                        </a:effectRef>
+                        <a:fontRef idx="minor">
+                          <a:schemeClr val="tx1"/>
+                        </a:fontRef>
+                      </wps:style>
+                      <wps:bodyPr/>
+                    </wps:wsp>
+                  </a:graphicData>
+                </a:graphic>
+                <wp14:sizeRelH relativeFrom="margin">
+                  <wp14:pctWidth>0</wp14:pctWidth>
+                </wp14:sizeRelH>
+                <wp14:sizeRelV relativeFrom="margin">
+                  <wp14:pctHeight>0</wp14:pctHeight>
+                </wp14:sizeRelV>
+              </wp:anchor>
+            </w:drawing>
+          </mc:Choice>
+          <mc:Fallback>
+            <w:pict>
+              <v:line w14:anchorId="2C07B2A5" id="Straight Connector 2" o:spid="_x0000_s1026" style="position:absolute;z-index:251662336;visibility:visible;mso-wrap-style:square;mso-width-percent:0;mso-height-percent:0;mso-wrap-distance-left:9pt;mso-wrap-distance-top:0;mso-wrap-distance-right:9pt;mso-wrap-distance-bottom:0;mso-position-horizontal:absolute;mso-position-horizontal-relative:text;mso-position-vertical:absolute;mso-position-vertical-relative:text;mso-width-percent:0;mso-height-percent:0;mso-width-relative:margin;mso-height-relative:margin" from="298.65pt,44.35pt" to="299.3pt,178pt" o:gfxdata="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" strokecolor="#4ea72e [3209]" strokeweight="1pt">
+                <v:stroke joinstyle="miter"/>
+              </v:line>
+            </w:pict>
+          </mc:Fallback>
+        </mc:AlternateContent>
+      </w:r>
       <w:r>
         <w:rPr>
           <w:noProof/>
@@ -109,7 +178,7 @@
         <mc:AlternateContent>
           <mc:Choice Requires="wps">
             <w:drawing>
-              <wp:anchor distT="0" distB="0" distL="114300" distR="114300" simplePos="0" relativeHeight="251663360" behindDoc="0" locked="0" layoutInCell="1" allowOverlap="1" wp14:anchorId="40C55795" wp14:editId="64AD2033">
+              <wp:anchor distT="0" distB="0" distL="114300" distR="114300" simplePos="0" relativeHeight="251663360" behindDoc="0" locked="0" layoutInCell="1" allowOverlap="1" wp14:anchorId="40C55795" wp14:editId="7CE37F6A">
                 <wp:simplePos x="0" y="0"/>
                 <wp:positionH relativeFrom="column">
                   <wp:posOffset>4169833</wp:posOffset>
@@ -151,6 +220,18 @@
                           <a:schemeClr val="lt1"/>
                         </a:fontRef>
                       </wps:style>
+                      <wps:txbx>
+                        <w:txbxContent>
+                          <w:p>
+                            <w:pPr>
+                              <w:jc w:val="center"/>
+                            </w:pPr>
+                            <w:r>
+                              <w:t>image</w:t>
+                            </w:r>
+                          </w:p>
+                        </w:txbxContent>
+                      </wps:txbx>
                       <wps:bodyPr rot="0" spcFirstLastPara="0" vertOverflow="overflow" horzOverflow="overflow" vert="horz" wrap="square" lIns="91440" tIns="45720" rIns="91440" bIns="45720" numCol="1" spcCol="0" rtlCol="0" fromWordArt="0" anchor="ctr" anchorCtr="0" forceAA="0" compatLnSpc="1">
                         <a:prstTxWarp prst="textNoShape">
                           <a:avLst/>
@@ -165,70 +246,20 @@
           </mc:Choice>
           <mc:Fallback>
             <w:pict>
-              <v:rect w14:anchorId="07EE8ED8" id="Rectangle 3" o:spid="_x0000_s1026" style="position:absolute;margin-left:328.35pt;margin-top:49.65pt;width:139.35pt;height:117.35pt;z-index:251663360;visibility:visible;mso-wrap-style:square;mso-wrap-distance-left:9pt;mso-wrap-distance-top:0;mso-wrap-distance-right:9pt;mso-wrap-distance-bottom:0;mso-position-horizontal:absolute;mso-position-horizontal-relative:text;mso-position-vertical:absolute;mso-position-vertical-relative:text;v-text-anchor:middle" o:gfxdata="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" fillcolor="#156082 [3204]" strokecolor="#030e13 [484]" strokeweight="1.5pt"/>
-            </w:pict>
-          </mc:Fallback>
-        </mc:AlternateContent>
-      </w:r>
-      <w:r>
-        <w:rPr>
-          <w:noProof/>
-        </w:rPr>
-        <mc:AlternateContent>
-          <mc:Choice Requires="wps">
-            <w:drawing>
-              <wp:anchor distT="0" distB="0" distL="114300" distR="114300" simplePos="0" relativeHeight="251662336" behindDoc="0" locked="0" layoutInCell="1" allowOverlap="1" wp14:anchorId="696FAEF7" wp14:editId="2334F58C">
-                <wp:simplePos x="0" y="0"/>
-                <wp:positionH relativeFrom="column">
-                  <wp:posOffset>3695700</wp:posOffset>
-                </wp:positionH>
-                <wp:positionV relativeFrom="paragraph">
-                  <wp:posOffset>567266</wp:posOffset>
-                </wp:positionV>
-                <wp:extent cx="105833" cy="1693333"/>
-                <wp:effectExtent l="0" t="0" r="27940" b="21590"/>
-                <wp:wrapNone/>
-                <wp:docPr id="1501247234" name="Straight Connector 2"/>
-                <wp:cNvGraphicFramePr/>
-                <a:graphic xmlns:a="http://schemas.openxmlformats.org/drawingml/2006/main">
-                  <a:graphicData uri="http://schemas.microsoft.com/office/word/2010/wordprocessingShape">
-                    <wps:wsp>
-                      <wps:cNvCnPr/>
-                      <wps:spPr>
-                        <a:xfrm>
-                          <a:off x="0" y="0"/>
-                          <a:ext cx="105833" cy="1693333"/>
-                        </a:xfrm>
-                        <a:prstGeom prst="line">
-                          <a:avLst/>
-                        </a:prstGeom>
-                      </wps:spPr>
-                      <wps:style>
-                        <a:lnRef idx="1">
-                          <a:schemeClr val="accent6"/>
-                        </a:lnRef>
-                        <a:fillRef idx="0">
-                          <a:schemeClr val="accent6"/>
-                        </a:fillRef>
-                        <a:effectRef idx="0">
-                          <a:schemeClr val="accent6"/>
-                        </a:effectRef>
-                        <a:fontRef idx="minor">
-                          <a:schemeClr val="tx1"/>
-                        </a:fontRef>
-                      </wps:style>
-                      <wps:bodyPr/>
-                    </wps:wsp>
-                  </a:graphicData>
-                </a:graphic>
-              </wp:anchor>
-            </w:drawing>
-          </mc:Choice>
-          <mc:Fallback>
-            <w:pict>
-              <v:line w14:anchorId="6860F1C5" id="Straight Connector 2" o:spid="_x0000_s1026" style="position:absolute;z-index:251662336;visibility:visible;mso-wrap-style:square;mso-wrap-distance-left:9pt;mso-wrap-distance-top:0;mso-wrap-distance-right:9pt;mso-wrap-distance-bottom:0;mso-position-horizontal:absolute;mso-position-horizontal-relative:text;mso-position-vertical:absolute;mso-position-vertical-relative:text" from="291pt,44.65pt" to="299.35pt,178pt" o:gfxdata="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" strokecolor="#4ea72e [3209]" strokeweight="1pt">
-                <v:stroke joinstyle="miter"/>
-              </v:line>
+              <v:rect w14:anchorId="40C55795" id="Rectangle 3" o:spid="_x0000_s1027" style="position:absolute;margin-left:328.35pt;margin-top:49.65pt;width:139.35pt;height:117.35pt;z-index:251663360;visibility:visible;mso-wrap-style:square;mso-wrap-distance-left:9pt;mso-wrap-distance-top:0;mso-wrap-distance-right:9pt;mso-wrap-distance-bottom:0;mso-position-horizontal:absolute;mso-position-horizontal-relative:text;mso-position-vertical:absolute;mso-position-vertical-relative:text;v-text-anchor:middle" o:gfxdata="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" fillcolor="#156082 [3204]" strokecolor="#030e13 [484]" strokeweight="1.5pt">
+                <v:textbox>
+                  <w:txbxContent>
+                    <w:p>
+                      <w:pPr>
+                        <w:jc w:val="center"/>
+                      </w:pPr>
+                      <w:r>
+                        <w:t>image</w:t>
+                      </w:r>
+                    </w:p>
+                  </w:txbxContent>
+                </v:textbox>
+              </v:rect>
             </w:pict>
           </mc:Fallback>
         </mc:AlternateContent>
@@ -340,7 +371,7 @@
           </mc:Choice>
           <mc:Fallback>
             <w:pict>
-              <v:rect w14:anchorId="359583BE" id="Rectangle 1" o:spid="_x0000_s1027" style="position:absolute;margin-left:3.35pt;margin-top:32.35pt;width:488.35pt;height:153.65pt;z-index:251661312;visibility:visible;mso-wrap-style:square;mso-wrap-distance-left:9pt;mso-wrap-distance-top:0;mso-wrap-distance-right:9pt;mso-wrap-distance-bottom:0;mso-position-horizontal:absolute;mso-position-horizontal-relative:text;mso-position-vertical:absolute;mso-position-vertical-relative:text;v-text-anchor:middle" o:gfxdata="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" fillcolor="#156082 [3204]" strokecolor="#030e13 [484]" strokeweight="1.5pt">
+              <v:rect w14:anchorId="359583BE" id="Rectangle 1" o:spid="_x0000_s1028" style="position:absolute;margin-left:3.35pt;margin-top:32.35pt;width:488.35pt;height:153.65pt;z-index:251661312;visibility:visible;mso-wrap-style:square;mso-wrap-distance-left:9pt;mso-wrap-distance-top:0;mso-wrap-distance-right:9pt;mso-wrap-distance-bottom:0;mso-position-horizontal:absolute;mso-position-horizontal-relative:text;mso-position-vertical:absolute;mso-position-vertical-relative:text;v-text-anchor:middle" o:gfxdata="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" fillcolor="#156082 [3204]" strokecolor="#030e13 [484]" strokeweight="1.5pt">
                 <v:textbox>
                   <w:txbxContent>
                     <w:p>
@@ -560,7 +591,7 @@
           </mc:Choice>
           <mc:Fallback>
             <w:pict>
-              <v:rect w14:anchorId="2DC3586E" id="Rectangle 2" o:spid="_x0000_s1028" style="position:absolute;margin-left:1.35pt;margin-top:.35pt;width:493.65pt;height:29.35pt;z-index:251660288;visibility:visible;mso-wrap-style:square;mso-wrap-distance-left:9pt;mso-wrap-distance-top:0;mso-wrap-distance-right:9pt;mso-wrap-distance-bottom:0;mso-position-horizontal:absolute;mso-position-horizontal-relative:text;mso-position-vertical:absolute;mso-position-vertical-relative:text;v-text-anchor:middle" o:gfxdata="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" fillcolor="#45b0e1 [1940]" strokecolor="#030e13 [484]" strokeweight="1.5pt">
+              <v:rect w14:anchorId="2DC3586E" id="Rectangle 2" o:spid="_x0000_s1029" style="position:absolute;margin-left:1.35pt;margin-top:.35pt;width:493.65pt;height:29.35pt;z-index:251660288;visibility:visible;mso-wrap-style:square;mso-wrap-distance-left:9pt;mso-wrap-distance-top:0;mso-wrap-distance-right:9pt;mso-wrap-distance-bottom:0;mso-position-horizontal:absolute;mso-position-horizontal-relative:text;mso-position-vertical:absolute;mso-position-vertical-relative:text;v-text-anchor:middle" o:gfxdata="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" fillcolor="#45b0e1 [1940]" strokecolor="#030e13 [484]" strokeweight="1.5pt">
                 <v:textbox>
                   <w:txbxContent>
                     <w:p>

</xml_diff>